<commit_message>
prepared idn spec and other my files for submission
</commit_message>
<xml_diff>
--- a/40488199/40488199_Design_Spec.docx
+++ b/40488199/40488199_Design_Spec.docx
@@ -440,7 +440,7 @@
           <w:sz w:val="24"/>
           <w:szCs w:val="24"/>
         </w:rPr>
-        <w:t>Initial Data Model (ERD)</w:t>
+        <w:t>Data Integrity and Security Considerations</w:t>
       </w:r>
     </w:p>
     <w:p>
@@ -453,6 +453,46 @@
           <w:szCs w:val="24"/>
         </w:rPr>
       </w:pPr>
+      <w:r>
+        <w:rPr>
+          <w:rFonts w:ascii="Times New Roman" w:hAnsi="Times New Roman" w:cs="Times New Roman"/>
+          <w:sz w:val="24"/>
+          <w:szCs w:val="24"/>
+        </w:rPr>
+        <w:t>Every table has a primary key to make sure each record is unique and can always be found. Foreign keys protect the relationships between tables</w:t>
+      </w:r>
+      <w:r>
+        <w:rPr>
+          <w:rFonts w:ascii="Times New Roman" w:hAnsi="Times New Roman" w:cs="Times New Roman"/>
+          <w:sz w:val="24"/>
+          <w:szCs w:val="24"/>
+        </w:rPr>
+        <w:t>,</w:t>
+      </w:r>
+      <w:r>
+        <w:rPr>
+          <w:rFonts w:ascii="Times New Roman" w:hAnsi="Times New Roman" w:cs="Times New Roman"/>
+          <w:sz w:val="24"/>
+          <w:szCs w:val="24"/>
+        </w:rPr>
+        <w:t xml:space="preserve"> without them it would be possible to link a trainer to a programme that does not exist</w:t>
+      </w:r>
+      <w:r>
+        <w:rPr>
+          <w:rFonts w:ascii="Times New Roman" w:hAnsi="Times New Roman" w:cs="Times New Roman"/>
+          <w:sz w:val="24"/>
+          <w:szCs w:val="24"/>
+        </w:rPr>
+        <w:t xml:space="preserve"> and that </w:t>
+      </w:r>
+      <w:r>
+        <w:rPr>
+          <w:rFonts w:ascii="Times New Roman" w:hAnsi="Times New Roman" w:cs="Times New Roman"/>
+          <w:sz w:val="24"/>
+          <w:szCs w:val="24"/>
+        </w:rPr>
+        <w:t xml:space="preserve">would make the data meaningless. NOT NULL constraints on fields like </w:t>
+      </w:r>
       <w:proofErr w:type="spellStart"/>
       <w:r>
         <w:rPr>
@@ -460,7 +500,7 @@
           <w:sz w:val="24"/>
           <w:szCs w:val="24"/>
         </w:rPr>
-        <w:t>tblRegion</w:t>
+        <w:t>enrolDate</w:t>
       </w:r>
       <w:proofErr w:type="spellEnd"/>
       <w:r>
@@ -469,7 +509,7 @@
           <w:sz w:val="24"/>
           <w:szCs w:val="24"/>
         </w:rPr>
-        <w:t xml:space="preserve"> (</w:t>
+        <w:t xml:space="preserve"> and </w:t>
       </w:r>
       <w:proofErr w:type="spellStart"/>
       <w:r>
@@ -478,7 +518,7 @@
           <w:sz w:val="24"/>
           <w:szCs w:val="24"/>
         </w:rPr>
-        <w:t>regionID</w:t>
+        <w:t>preAssessmentScore</w:t>
       </w:r>
       <w:proofErr w:type="spellEnd"/>
       <w:r>
@@ -487,7 +527,7 @@
           <w:sz w:val="24"/>
           <w:szCs w:val="24"/>
         </w:rPr>
-        <w:t xml:space="preserve"> [PK], </w:t>
+        <w:t xml:space="preserve"> prevent incomplete records that could break reports. A UNIQUE constraint on </w:t>
       </w:r>
       <w:proofErr w:type="spellStart"/>
       <w:r>
@@ -496,7 +536,7 @@
           <w:sz w:val="24"/>
           <w:szCs w:val="24"/>
         </w:rPr>
-        <w:t>regionName</w:t>
+        <w:t>participantID</w:t>
       </w:r>
       <w:proofErr w:type="spellEnd"/>
       <w:r>
@@ -505,7 +545,7 @@
           <w:sz w:val="24"/>
           <w:szCs w:val="24"/>
         </w:rPr>
-        <w:t xml:space="preserve">, country, </w:t>
+        <w:t xml:space="preserve"> and </w:t>
       </w:r>
       <w:proofErr w:type="spellStart"/>
       <w:r>
@@ -514,7 +554,7 @@
           <w:sz w:val="24"/>
           <w:szCs w:val="24"/>
         </w:rPr>
-        <w:t>areaType</w:t>
+        <w:t>pcID</w:t>
       </w:r>
       <w:proofErr w:type="spellEnd"/>
       <w:r>
@@ -523,7 +563,7 @@
           <w:sz w:val="24"/>
           <w:szCs w:val="24"/>
         </w:rPr>
-        <w:t xml:space="preserve">, </w:t>
+        <w:t xml:space="preserve"> together in </w:t>
       </w:r>
       <w:proofErr w:type="spellStart"/>
       <w:r>
@@ -532,7 +572,7 @@
           <w:sz w:val="24"/>
           <w:szCs w:val="24"/>
         </w:rPr>
-        <w:t>populationSize</w:t>
+        <w:t>tblEnrolment</w:t>
       </w:r>
       <w:proofErr w:type="spellEnd"/>
       <w:r>
@@ -541,1422 +581,167 @@
           <w:sz w:val="24"/>
           <w:szCs w:val="24"/>
         </w:rPr>
-        <w:t>)</w:t>
+        <w:t xml:space="preserve"> stops the same person being accidentally enrolled twice in the same course. Restricting fields like gender, </w:t>
+      </w:r>
+      <w:proofErr w:type="spellStart"/>
+      <w:r>
+        <w:rPr>
+          <w:rFonts w:ascii="Times New Roman" w:hAnsi="Times New Roman" w:cs="Times New Roman"/>
+          <w:sz w:val="24"/>
+          <w:szCs w:val="24"/>
+        </w:rPr>
+        <w:t>completionStatus</w:t>
+      </w:r>
+      <w:proofErr w:type="spellEnd"/>
+      <w:r>
+        <w:rPr>
+          <w:rFonts w:ascii="Times New Roman" w:hAnsi="Times New Roman" w:cs="Times New Roman"/>
+          <w:sz w:val="24"/>
+          <w:szCs w:val="24"/>
+        </w:rPr>
+        <w:t xml:space="preserve">, and </w:t>
+      </w:r>
+      <w:proofErr w:type="spellStart"/>
+      <w:r>
+        <w:rPr>
+          <w:rFonts w:ascii="Times New Roman" w:hAnsi="Times New Roman" w:cs="Times New Roman"/>
+          <w:sz w:val="24"/>
+          <w:szCs w:val="24"/>
+        </w:rPr>
+        <w:t>difficultyLevel</w:t>
+      </w:r>
+      <w:proofErr w:type="spellEnd"/>
+      <w:r>
+        <w:rPr>
+          <w:rFonts w:ascii="Times New Roman" w:hAnsi="Times New Roman" w:cs="Times New Roman"/>
+          <w:sz w:val="24"/>
+          <w:szCs w:val="24"/>
+        </w:rPr>
+        <w:t xml:space="preserve"> to set values keeps the data consistent, which matters especially when filtering or comparing groups in reports. Derived values like </w:t>
+      </w:r>
+      <w:proofErr w:type="spellStart"/>
+      <w:r>
+        <w:rPr>
+          <w:rFonts w:ascii="Times New Roman" w:hAnsi="Times New Roman" w:cs="Times New Roman"/>
+          <w:sz w:val="24"/>
+          <w:szCs w:val="24"/>
+        </w:rPr>
+        <w:t>scoreImprovement</w:t>
+      </w:r>
+      <w:proofErr w:type="spellEnd"/>
+      <w:r>
+        <w:rPr>
+          <w:rFonts w:ascii="Times New Roman" w:hAnsi="Times New Roman" w:cs="Times New Roman"/>
+          <w:sz w:val="24"/>
+          <w:szCs w:val="24"/>
+        </w:rPr>
+        <w:t xml:space="preserve"> and duration are calculated at query time rather than stored, so they are always accurate and never out of sync with the source data. Front-end validation — for example checking scores are between 0 and 100, or that end dates come after start dates — catches mistakes before they reach the database. Confirmation dialogs before deleting programmes or participants reduce the risk of accidental data loss. Finally, separating administrator and read-only roles </w:t>
+      </w:r>
+      <w:proofErr w:type="gramStart"/>
+      <w:r>
+        <w:rPr>
+          <w:rFonts w:ascii="Times New Roman" w:hAnsi="Times New Roman" w:cs="Times New Roman"/>
+          <w:sz w:val="24"/>
+          <w:szCs w:val="24"/>
+        </w:rPr>
+        <w:t>means</w:t>
+      </w:r>
+      <w:proofErr w:type="gramEnd"/>
+      <w:r>
+        <w:rPr>
+          <w:rFonts w:ascii="Times New Roman" w:hAnsi="Times New Roman" w:cs="Times New Roman"/>
+          <w:sz w:val="24"/>
+          <w:szCs w:val="24"/>
+        </w:rPr>
+        <w:t xml:space="preserve"> education officers can never accidentally modify or delete records they should only be viewing.</w:t>
       </w:r>
     </w:p>
     <w:p>
       <w:pPr>
+        <w:pStyle w:val="Heading3"/>
         <w:spacing w:after="0" w:line="276" w:lineRule="auto"/>
         <w:jc w:val="both"/>
         <w:rPr>
           <w:rFonts w:ascii="Times New Roman" w:hAnsi="Times New Roman" w:cs="Times New Roman"/>
-          <w:sz w:val="24"/>
-          <w:szCs w:val="24"/>
-        </w:rPr>
-      </w:pPr>
-      <w:proofErr w:type="spellStart"/>
-      <w:r>
-        <w:rPr>
-          <w:rFonts w:ascii="Times New Roman" w:hAnsi="Times New Roman" w:cs="Times New Roman"/>
-          <w:sz w:val="24"/>
-          <w:szCs w:val="24"/>
-        </w:rPr>
-        <w:t>tblFundingSource</w:t>
-      </w:r>
-      <w:proofErr w:type="spellEnd"/>
-      <w:r>
-        <w:rPr>
-          <w:rFonts w:ascii="Times New Roman" w:hAnsi="Times New Roman" w:cs="Times New Roman"/>
-          <w:sz w:val="24"/>
-          <w:szCs w:val="24"/>
-        </w:rPr>
-        <w:t xml:space="preserve"> (</w:t>
-      </w:r>
-      <w:proofErr w:type="spellStart"/>
-      <w:r>
-        <w:rPr>
-          <w:rFonts w:ascii="Times New Roman" w:hAnsi="Times New Roman" w:cs="Times New Roman"/>
-          <w:sz w:val="24"/>
-          <w:szCs w:val="24"/>
-        </w:rPr>
-        <w:t>sourceID</w:t>
-      </w:r>
-      <w:proofErr w:type="spellEnd"/>
-      <w:r>
-        <w:rPr>
-          <w:rFonts w:ascii="Times New Roman" w:hAnsi="Times New Roman" w:cs="Times New Roman"/>
-          <w:sz w:val="24"/>
-          <w:szCs w:val="24"/>
-        </w:rPr>
-        <w:t xml:space="preserve"> [PK], </w:t>
-      </w:r>
-      <w:proofErr w:type="spellStart"/>
-      <w:r>
-        <w:rPr>
-          <w:rFonts w:ascii="Times New Roman" w:hAnsi="Times New Roman" w:cs="Times New Roman"/>
-          <w:sz w:val="24"/>
-          <w:szCs w:val="24"/>
-        </w:rPr>
-        <w:t>sourceName</w:t>
-      </w:r>
-      <w:proofErr w:type="spellEnd"/>
-      <w:r>
-        <w:rPr>
-          <w:rFonts w:ascii="Times New Roman" w:hAnsi="Times New Roman" w:cs="Times New Roman"/>
-          <w:sz w:val="24"/>
-          <w:szCs w:val="24"/>
-        </w:rPr>
-        <w:t xml:space="preserve">, </w:t>
-      </w:r>
-      <w:proofErr w:type="spellStart"/>
-      <w:r>
-        <w:rPr>
-          <w:rFonts w:ascii="Times New Roman" w:hAnsi="Times New Roman" w:cs="Times New Roman"/>
-          <w:sz w:val="24"/>
-          <w:szCs w:val="24"/>
-        </w:rPr>
-        <w:t>sourceType</w:t>
-      </w:r>
-      <w:proofErr w:type="spellEnd"/>
-      <w:r>
-        <w:rPr>
-          <w:rFonts w:ascii="Times New Roman" w:hAnsi="Times New Roman" w:cs="Times New Roman"/>
-          <w:sz w:val="24"/>
-          <w:szCs w:val="24"/>
-        </w:rPr>
-        <w:t xml:space="preserve">, </w:t>
-      </w:r>
-      <w:proofErr w:type="spellStart"/>
-      <w:r>
-        <w:rPr>
-          <w:rFonts w:ascii="Times New Roman" w:hAnsi="Times New Roman" w:cs="Times New Roman"/>
-          <w:sz w:val="24"/>
-          <w:szCs w:val="24"/>
-        </w:rPr>
-        <w:t>contactEmail</w:t>
-      </w:r>
-      <w:proofErr w:type="spellEnd"/>
-      <w:r>
-        <w:rPr>
-          <w:rFonts w:ascii="Times New Roman" w:hAnsi="Times New Roman" w:cs="Times New Roman"/>
-          <w:sz w:val="24"/>
-          <w:szCs w:val="24"/>
-        </w:rPr>
-        <w:t xml:space="preserve">, </w:t>
-      </w:r>
-      <w:proofErr w:type="spellStart"/>
-      <w:r>
-        <w:rPr>
-          <w:rFonts w:ascii="Times New Roman" w:hAnsi="Times New Roman" w:cs="Times New Roman"/>
-          <w:sz w:val="24"/>
-          <w:szCs w:val="24"/>
-        </w:rPr>
-        <w:t>isActive</w:t>
-      </w:r>
-      <w:proofErr w:type="spellEnd"/>
-      <w:r>
-        <w:rPr>
-          <w:rFonts w:ascii="Times New Roman" w:hAnsi="Times New Roman" w:cs="Times New Roman"/>
-          <w:sz w:val="24"/>
-          <w:szCs w:val="24"/>
-        </w:rPr>
-        <w:t>)</w:t>
-      </w:r>
-    </w:p>
-    <w:p>
-      <w:pPr>
-        <w:spacing w:after="0" w:line="276" w:lineRule="auto"/>
-        <w:jc w:val="both"/>
-        <w:rPr>
-          <w:rFonts w:ascii="Times New Roman" w:hAnsi="Times New Roman" w:cs="Times New Roman"/>
-          <w:sz w:val="24"/>
-          <w:szCs w:val="24"/>
-        </w:rPr>
-      </w:pPr>
-      <w:proofErr w:type="spellStart"/>
-      <w:r>
-        <w:rPr>
-          <w:rFonts w:ascii="Times New Roman" w:hAnsi="Times New Roman" w:cs="Times New Roman"/>
-          <w:sz w:val="24"/>
-          <w:szCs w:val="24"/>
-        </w:rPr>
-        <w:t>tblTrainer</w:t>
-      </w:r>
-      <w:proofErr w:type="spellEnd"/>
-      <w:r>
-        <w:rPr>
-          <w:rFonts w:ascii="Times New Roman" w:hAnsi="Times New Roman" w:cs="Times New Roman"/>
-          <w:sz w:val="24"/>
-          <w:szCs w:val="24"/>
-        </w:rPr>
-        <w:t xml:space="preserve"> (</w:t>
-      </w:r>
-      <w:proofErr w:type="spellStart"/>
-      <w:r>
-        <w:rPr>
-          <w:rFonts w:ascii="Times New Roman" w:hAnsi="Times New Roman" w:cs="Times New Roman"/>
-          <w:sz w:val="24"/>
-          <w:szCs w:val="24"/>
-        </w:rPr>
-        <w:t>trainerID</w:t>
-      </w:r>
-      <w:proofErr w:type="spellEnd"/>
-      <w:r>
-        <w:rPr>
-          <w:rFonts w:ascii="Times New Roman" w:hAnsi="Times New Roman" w:cs="Times New Roman"/>
-          <w:sz w:val="24"/>
-          <w:szCs w:val="24"/>
-        </w:rPr>
-        <w:t xml:space="preserve"> [PK], </w:t>
-      </w:r>
-      <w:proofErr w:type="spellStart"/>
-      <w:r>
-        <w:rPr>
-          <w:rFonts w:ascii="Times New Roman" w:hAnsi="Times New Roman" w:cs="Times New Roman"/>
-          <w:sz w:val="24"/>
-          <w:szCs w:val="24"/>
-        </w:rPr>
-        <w:t>firstName</w:t>
-      </w:r>
-      <w:proofErr w:type="spellEnd"/>
-      <w:r>
-        <w:rPr>
-          <w:rFonts w:ascii="Times New Roman" w:hAnsi="Times New Roman" w:cs="Times New Roman"/>
-          <w:sz w:val="24"/>
-          <w:szCs w:val="24"/>
-        </w:rPr>
-        <w:t xml:space="preserve">, </w:t>
-      </w:r>
-      <w:proofErr w:type="spellStart"/>
-      <w:r>
-        <w:rPr>
-          <w:rFonts w:ascii="Times New Roman" w:hAnsi="Times New Roman" w:cs="Times New Roman"/>
-          <w:sz w:val="24"/>
-          <w:szCs w:val="24"/>
-        </w:rPr>
-        <w:t>lastName</w:t>
-      </w:r>
-      <w:proofErr w:type="spellEnd"/>
-      <w:r>
-        <w:rPr>
-          <w:rFonts w:ascii="Times New Roman" w:hAnsi="Times New Roman" w:cs="Times New Roman"/>
-          <w:sz w:val="24"/>
-          <w:szCs w:val="24"/>
-        </w:rPr>
-        <w:t xml:space="preserve">, </w:t>
-      </w:r>
-      <w:proofErr w:type="spellStart"/>
-      <w:r>
-        <w:rPr>
-          <w:rFonts w:ascii="Times New Roman" w:hAnsi="Times New Roman" w:cs="Times New Roman"/>
-          <w:sz w:val="24"/>
-          <w:szCs w:val="24"/>
-        </w:rPr>
-        <w:t>fullName</w:t>
-      </w:r>
-      <w:proofErr w:type="spellEnd"/>
-      <w:r>
-        <w:rPr>
-          <w:rFonts w:ascii="Times New Roman" w:hAnsi="Times New Roman" w:cs="Times New Roman"/>
-          <w:sz w:val="24"/>
-          <w:szCs w:val="24"/>
-        </w:rPr>
-        <w:t xml:space="preserve">* [derived], email, specialisation, </w:t>
-      </w:r>
-      <w:proofErr w:type="spellStart"/>
-      <w:r>
-        <w:rPr>
-          <w:rFonts w:ascii="Times New Roman" w:hAnsi="Times New Roman" w:cs="Times New Roman"/>
-          <w:sz w:val="24"/>
-          <w:szCs w:val="24"/>
-        </w:rPr>
-        <w:t>certifiedDate</w:t>
-      </w:r>
-      <w:proofErr w:type="spellEnd"/>
-      <w:r>
-        <w:rPr>
-          <w:rFonts w:ascii="Times New Roman" w:hAnsi="Times New Roman" w:cs="Times New Roman"/>
-          <w:sz w:val="24"/>
-          <w:szCs w:val="24"/>
-        </w:rPr>
-        <w:t xml:space="preserve">, </w:t>
-      </w:r>
-      <w:proofErr w:type="spellStart"/>
-      <w:r>
-        <w:rPr>
-          <w:rFonts w:ascii="Times New Roman" w:hAnsi="Times New Roman" w:cs="Times New Roman"/>
-          <w:sz w:val="24"/>
-          <w:szCs w:val="24"/>
-        </w:rPr>
-        <w:t>regionID</w:t>
-      </w:r>
-      <w:proofErr w:type="spellEnd"/>
-      <w:r>
-        <w:rPr>
-          <w:rFonts w:ascii="Times New Roman" w:hAnsi="Times New Roman" w:cs="Times New Roman"/>
-          <w:sz w:val="24"/>
-          <w:szCs w:val="24"/>
-        </w:rPr>
-        <w:t xml:space="preserve"> [FK])</w:t>
-      </w:r>
-    </w:p>
-    <w:p>
-      <w:pPr>
-        <w:spacing w:after="0" w:line="276" w:lineRule="auto"/>
-        <w:jc w:val="both"/>
-        <w:rPr>
-          <w:rFonts w:ascii="Times New Roman" w:hAnsi="Times New Roman" w:cs="Times New Roman"/>
-          <w:sz w:val="24"/>
-          <w:szCs w:val="24"/>
-        </w:rPr>
-      </w:pPr>
-      <w:proofErr w:type="spellStart"/>
-      <w:r>
-        <w:rPr>
-          <w:rFonts w:ascii="Times New Roman" w:hAnsi="Times New Roman" w:cs="Times New Roman"/>
-          <w:sz w:val="24"/>
-          <w:szCs w:val="24"/>
-        </w:rPr>
-        <w:t>tblCourse</w:t>
-      </w:r>
-      <w:proofErr w:type="spellEnd"/>
-      <w:r>
-        <w:rPr>
-          <w:rFonts w:ascii="Times New Roman" w:hAnsi="Times New Roman" w:cs="Times New Roman"/>
-          <w:sz w:val="24"/>
-          <w:szCs w:val="24"/>
-        </w:rPr>
-        <w:t xml:space="preserve"> (</w:t>
-      </w:r>
-      <w:proofErr w:type="spellStart"/>
-      <w:r>
-        <w:rPr>
-          <w:rFonts w:ascii="Times New Roman" w:hAnsi="Times New Roman" w:cs="Times New Roman"/>
-          <w:sz w:val="24"/>
-          <w:szCs w:val="24"/>
-        </w:rPr>
-        <w:t>courseID</w:t>
-      </w:r>
-      <w:proofErr w:type="spellEnd"/>
-      <w:r>
-        <w:rPr>
-          <w:rFonts w:ascii="Times New Roman" w:hAnsi="Times New Roman" w:cs="Times New Roman"/>
-          <w:sz w:val="24"/>
-          <w:szCs w:val="24"/>
-        </w:rPr>
-        <w:t xml:space="preserve"> [PK], </w:t>
-      </w:r>
-      <w:proofErr w:type="spellStart"/>
-      <w:r>
-        <w:rPr>
-          <w:rFonts w:ascii="Times New Roman" w:hAnsi="Times New Roman" w:cs="Times New Roman"/>
-          <w:sz w:val="24"/>
-          <w:szCs w:val="24"/>
-        </w:rPr>
-        <w:t>courseName</w:t>
-      </w:r>
-      <w:proofErr w:type="spellEnd"/>
-      <w:r>
-        <w:rPr>
-          <w:rFonts w:ascii="Times New Roman" w:hAnsi="Times New Roman" w:cs="Times New Roman"/>
-          <w:sz w:val="24"/>
-          <w:szCs w:val="24"/>
-        </w:rPr>
-        <w:t xml:space="preserve">, </w:t>
-      </w:r>
-      <w:proofErr w:type="spellStart"/>
-      <w:r>
-        <w:rPr>
-          <w:rFonts w:ascii="Times New Roman" w:hAnsi="Times New Roman" w:cs="Times New Roman"/>
-          <w:sz w:val="24"/>
-          <w:szCs w:val="24"/>
-        </w:rPr>
-        <w:t>skillCategory</w:t>
-      </w:r>
-      <w:proofErr w:type="spellEnd"/>
-      <w:r>
-        <w:rPr>
-          <w:rFonts w:ascii="Times New Roman" w:hAnsi="Times New Roman" w:cs="Times New Roman"/>
-          <w:sz w:val="24"/>
-          <w:szCs w:val="24"/>
-        </w:rPr>
-        <w:t xml:space="preserve">, </w:t>
-      </w:r>
-      <w:proofErr w:type="spellStart"/>
-      <w:r>
-        <w:rPr>
-          <w:rFonts w:ascii="Times New Roman" w:hAnsi="Times New Roman" w:cs="Times New Roman"/>
-          <w:sz w:val="24"/>
-          <w:szCs w:val="24"/>
-        </w:rPr>
-        <w:t>durationHours</w:t>
-      </w:r>
-      <w:proofErr w:type="spellEnd"/>
-      <w:r>
-        <w:rPr>
-          <w:rFonts w:ascii="Times New Roman" w:hAnsi="Times New Roman" w:cs="Times New Roman"/>
-          <w:sz w:val="24"/>
-          <w:szCs w:val="24"/>
-        </w:rPr>
-        <w:t xml:space="preserve">, </w:t>
-      </w:r>
-      <w:proofErr w:type="spellStart"/>
-      <w:r>
-        <w:rPr>
-          <w:rFonts w:ascii="Times New Roman" w:hAnsi="Times New Roman" w:cs="Times New Roman"/>
-          <w:sz w:val="24"/>
-          <w:szCs w:val="24"/>
-        </w:rPr>
-        <w:t>difficultyLevel</w:t>
-      </w:r>
-      <w:proofErr w:type="spellEnd"/>
-      <w:r>
-        <w:rPr>
-          <w:rFonts w:ascii="Times New Roman" w:hAnsi="Times New Roman" w:cs="Times New Roman"/>
-          <w:sz w:val="24"/>
-          <w:szCs w:val="24"/>
-        </w:rPr>
-        <w:t>, description [optional])</w:t>
-      </w:r>
-    </w:p>
-    <w:p>
-      <w:pPr>
-        <w:spacing w:after="0" w:line="276" w:lineRule="auto"/>
-        <w:jc w:val="both"/>
-        <w:rPr>
-          <w:rFonts w:ascii="Times New Roman" w:hAnsi="Times New Roman" w:cs="Times New Roman"/>
-          <w:sz w:val="24"/>
-          <w:szCs w:val="24"/>
-        </w:rPr>
-      </w:pPr>
-      <w:proofErr w:type="spellStart"/>
-      <w:r>
-        <w:rPr>
-          <w:rFonts w:ascii="Times New Roman" w:hAnsi="Times New Roman" w:cs="Times New Roman"/>
-          <w:sz w:val="24"/>
-          <w:szCs w:val="24"/>
-        </w:rPr>
-        <w:t>tblProgramme</w:t>
-      </w:r>
-      <w:proofErr w:type="spellEnd"/>
-      <w:r>
-        <w:rPr>
-          <w:rFonts w:ascii="Times New Roman" w:hAnsi="Times New Roman" w:cs="Times New Roman"/>
-          <w:sz w:val="24"/>
-          <w:szCs w:val="24"/>
-        </w:rPr>
-        <w:t xml:space="preserve"> (</w:t>
-      </w:r>
-      <w:proofErr w:type="spellStart"/>
-      <w:r>
-        <w:rPr>
-          <w:rFonts w:ascii="Times New Roman" w:hAnsi="Times New Roman" w:cs="Times New Roman"/>
-          <w:sz w:val="24"/>
-          <w:szCs w:val="24"/>
-        </w:rPr>
-        <w:t>programmeID</w:t>
-      </w:r>
-      <w:proofErr w:type="spellEnd"/>
-      <w:r>
-        <w:rPr>
-          <w:rFonts w:ascii="Times New Roman" w:hAnsi="Times New Roman" w:cs="Times New Roman"/>
-          <w:sz w:val="24"/>
-          <w:szCs w:val="24"/>
-        </w:rPr>
-        <w:t xml:space="preserve"> [PK], </w:t>
-      </w:r>
-      <w:proofErr w:type="spellStart"/>
-      <w:r>
-        <w:rPr>
-          <w:rFonts w:ascii="Times New Roman" w:hAnsi="Times New Roman" w:cs="Times New Roman"/>
-          <w:sz w:val="24"/>
-          <w:szCs w:val="24"/>
-        </w:rPr>
-        <w:t>programmeName</w:t>
-      </w:r>
-      <w:proofErr w:type="spellEnd"/>
-      <w:r>
-        <w:rPr>
-          <w:rFonts w:ascii="Times New Roman" w:hAnsi="Times New Roman" w:cs="Times New Roman"/>
-          <w:sz w:val="24"/>
-          <w:szCs w:val="24"/>
-        </w:rPr>
-        <w:t xml:space="preserve">, </w:t>
-      </w:r>
-      <w:proofErr w:type="spellStart"/>
-      <w:r>
-        <w:rPr>
-          <w:rFonts w:ascii="Times New Roman" w:hAnsi="Times New Roman" w:cs="Times New Roman"/>
-          <w:sz w:val="24"/>
-          <w:szCs w:val="24"/>
-        </w:rPr>
-        <w:t>regionID</w:t>
-      </w:r>
-      <w:proofErr w:type="spellEnd"/>
-      <w:r>
-        <w:rPr>
-          <w:rFonts w:ascii="Times New Roman" w:hAnsi="Times New Roman" w:cs="Times New Roman"/>
-          <w:sz w:val="24"/>
-          <w:szCs w:val="24"/>
-        </w:rPr>
-        <w:t xml:space="preserve"> [FK], </w:t>
-      </w:r>
-      <w:proofErr w:type="spellStart"/>
-      <w:r>
-        <w:rPr>
-          <w:rFonts w:ascii="Times New Roman" w:hAnsi="Times New Roman" w:cs="Times New Roman"/>
-          <w:sz w:val="24"/>
-          <w:szCs w:val="24"/>
-        </w:rPr>
-        <w:t>sourceID</w:t>
-      </w:r>
-      <w:proofErr w:type="spellEnd"/>
-      <w:r>
-        <w:rPr>
-          <w:rFonts w:ascii="Times New Roman" w:hAnsi="Times New Roman" w:cs="Times New Roman"/>
-          <w:sz w:val="24"/>
-          <w:szCs w:val="24"/>
-        </w:rPr>
-        <w:t xml:space="preserve"> [FK], </w:t>
-      </w:r>
-      <w:proofErr w:type="spellStart"/>
-      <w:r>
-        <w:rPr>
-          <w:rFonts w:ascii="Times New Roman" w:hAnsi="Times New Roman" w:cs="Times New Roman"/>
-          <w:sz w:val="24"/>
-          <w:szCs w:val="24"/>
-        </w:rPr>
-        <w:t>startDate</w:t>
-      </w:r>
-      <w:proofErr w:type="spellEnd"/>
-      <w:r>
-        <w:rPr>
-          <w:rFonts w:ascii="Times New Roman" w:hAnsi="Times New Roman" w:cs="Times New Roman"/>
-          <w:sz w:val="24"/>
-          <w:szCs w:val="24"/>
-        </w:rPr>
-        <w:t xml:space="preserve">, </w:t>
-      </w:r>
-      <w:proofErr w:type="spellStart"/>
-      <w:r>
-        <w:rPr>
-          <w:rFonts w:ascii="Times New Roman" w:hAnsi="Times New Roman" w:cs="Times New Roman"/>
-          <w:sz w:val="24"/>
-          <w:szCs w:val="24"/>
-        </w:rPr>
-        <w:t>endDate</w:t>
-      </w:r>
-      <w:proofErr w:type="spellEnd"/>
-      <w:r>
-        <w:rPr>
-          <w:rFonts w:ascii="Times New Roman" w:hAnsi="Times New Roman" w:cs="Times New Roman"/>
-          <w:sz w:val="24"/>
-          <w:szCs w:val="24"/>
-        </w:rPr>
-        <w:t>, duration* [derived], budget, status)</w:t>
-      </w:r>
-    </w:p>
-    <w:p>
-      <w:pPr>
-        <w:spacing w:after="0" w:line="276" w:lineRule="auto"/>
-        <w:jc w:val="both"/>
-        <w:rPr>
-          <w:rFonts w:ascii="Times New Roman" w:hAnsi="Times New Roman" w:cs="Times New Roman"/>
-          <w:sz w:val="24"/>
-          <w:szCs w:val="24"/>
-        </w:rPr>
-      </w:pPr>
-      <w:proofErr w:type="spellStart"/>
-      <w:r>
-        <w:rPr>
-          <w:rFonts w:ascii="Times New Roman" w:hAnsi="Times New Roman" w:cs="Times New Roman"/>
-          <w:sz w:val="24"/>
-          <w:szCs w:val="24"/>
-        </w:rPr>
-        <w:t>tblProgrammeCourse</w:t>
-      </w:r>
-      <w:proofErr w:type="spellEnd"/>
-      <w:r>
-        <w:rPr>
-          <w:rFonts w:ascii="Times New Roman" w:hAnsi="Times New Roman" w:cs="Times New Roman"/>
-          <w:sz w:val="24"/>
-          <w:szCs w:val="24"/>
-        </w:rPr>
-        <w:t xml:space="preserve"> (</w:t>
-      </w:r>
-      <w:proofErr w:type="spellStart"/>
-      <w:r>
-        <w:rPr>
-          <w:rFonts w:ascii="Times New Roman" w:hAnsi="Times New Roman" w:cs="Times New Roman"/>
-          <w:sz w:val="24"/>
-          <w:szCs w:val="24"/>
-        </w:rPr>
-        <w:t>pcID</w:t>
-      </w:r>
-      <w:proofErr w:type="spellEnd"/>
-      <w:r>
-        <w:rPr>
-          <w:rFonts w:ascii="Times New Roman" w:hAnsi="Times New Roman" w:cs="Times New Roman"/>
-          <w:sz w:val="24"/>
-          <w:szCs w:val="24"/>
-        </w:rPr>
-        <w:t xml:space="preserve"> [PK], </w:t>
-      </w:r>
-      <w:proofErr w:type="spellStart"/>
-      <w:r>
-        <w:rPr>
-          <w:rFonts w:ascii="Times New Roman" w:hAnsi="Times New Roman" w:cs="Times New Roman"/>
-          <w:sz w:val="24"/>
-          <w:szCs w:val="24"/>
-        </w:rPr>
-        <w:t>programmeID</w:t>
-      </w:r>
-      <w:proofErr w:type="spellEnd"/>
-      <w:r>
-        <w:rPr>
-          <w:rFonts w:ascii="Times New Roman" w:hAnsi="Times New Roman" w:cs="Times New Roman"/>
-          <w:sz w:val="24"/>
-          <w:szCs w:val="24"/>
-        </w:rPr>
-        <w:t xml:space="preserve"> [FK], </w:t>
-      </w:r>
-      <w:proofErr w:type="spellStart"/>
-      <w:r>
-        <w:rPr>
-          <w:rFonts w:ascii="Times New Roman" w:hAnsi="Times New Roman" w:cs="Times New Roman"/>
-          <w:sz w:val="24"/>
-          <w:szCs w:val="24"/>
-        </w:rPr>
-        <w:t>courseID</w:t>
-      </w:r>
-      <w:proofErr w:type="spellEnd"/>
-      <w:r>
-        <w:rPr>
-          <w:rFonts w:ascii="Times New Roman" w:hAnsi="Times New Roman" w:cs="Times New Roman"/>
-          <w:sz w:val="24"/>
-          <w:szCs w:val="24"/>
-        </w:rPr>
-        <w:t xml:space="preserve"> [FK], </w:t>
-      </w:r>
-      <w:proofErr w:type="spellStart"/>
-      <w:r>
-        <w:rPr>
-          <w:rFonts w:ascii="Times New Roman" w:hAnsi="Times New Roman" w:cs="Times New Roman"/>
-          <w:sz w:val="24"/>
-          <w:szCs w:val="24"/>
-        </w:rPr>
-        <w:t>scheduledSessions</w:t>
-      </w:r>
-      <w:proofErr w:type="spellEnd"/>
-      <w:r>
-        <w:rPr>
-          <w:rFonts w:ascii="Times New Roman" w:hAnsi="Times New Roman" w:cs="Times New Roman"/>
-          <w:sz w:val="24"/>
-          <w:szCs w:val="24"/>
-        </w:rPr>
-        <w:t xml:space="preserve">, </w:t>
-      </w:r>
-      <w:proofErr w:type="spellStart"/>
-      <w:r>
-        <w:rPr>
-          <w:rFonts w:ascii="Times New Roman" w:hAnsi="Times New Roman" w:cs="Times New Roman"/>
-          <w:sz w:val="24"/>
-          <w:szCs w:val="24"/>
-        </w:rPr>
-        <w:t>trainerID</w:t>
-      </w:r>
-      <w:proofErr w:type="spellEnd"/>
-      <w:r>
-        <w:rPr>
-          <w:rFonts w:ascii="Times New Roman" w:hAnsi="Times New Roman" w:cs="Times New Roman"/>
-          <w:sz w:val="24"/>
-          <w:szCs w:val="24"/>
-        </w:rPr>
-        <w:t xml:space="preserve"> [FK])</w:t>
-      </w:r>
-    </w:p>
-    <w:p>
-      <w:pPr>
-        <w:spacing w:after="0" w:line="276" w:lineRule="auto"/>
-        <w:jc w:val="both"/>
-        <w:rPr>
-          <w:rFonts w:ascii="Times New Roman" w:hAnsi="Times New Roman" w:cs="Times New Roman"/>
-          <w:sz w:val="24"/>
-          <w:szCs w:val="24"/>
-        </w:rPr>
-      </w:pPr>
-      <w:proofErr w:type="spellStart"/>
-      <w:r>
-        <w:rPr>
-          <w:rFonts w:ascii="Times New Roman" w:hAnsi="Times New Roman" w:cs="Times New Roman"/>
-          <w:sz w:val="24"/>
-          <w:szCs w:val="24"/>
-        </w:rPr>
-        <w:t>tblParticipant</w:t>
-      </w:r>
-      <w:proofErr w:type="spellEnd"/>
-      <w:r>
-        <w:rPr>
-          <w:rFonts w:ascii="Times New Roman" w:hAnsi="Times New Roman" w:cs="Times New Roman"/>
-          <w:sz w:val="24"/>
-          <w:szCs w:val="24"/>
-        </w:rPr>
-        <w:t xml:space="preserve"> (</w:t>
-      </w:r>
-      <w:proofErr w:type="spellStart"/>
-      <w:r>
-        <w:rPr>
-          <w:rFonts w:ascii="Times New Roman" w:hAnsi="Times New Roman" w:cs="Times New Roman"/>
-          <w:sz w:val="24"/>
-          <w:szCs w:val="24"/>
-        </w:rPr>
-        <w:t>participantID</w:t>
-      </w:r>
-      <w:proofErr w:type="spellEnd"/>
-      <w:r>
-        <w:rPr>
-          <w:rFonts w:ascii="Times New Roman" w:hAnsi="Times New Roman" w:cs="Times New Roman"/>
-          <w:sz w:val="24"/>
-          <w:szCs w:val="24"/>
-        </w:rPr>
-        <w:t xml:space="preserve"> [PK], </w:t>
-      </w:r>
-      <w:proofErr w:type="spellStart"/>
-      <w:r>
-        <w:rPr>
-          <w:rFonts w:ascii="Times New Roman" w:hAnsi="Times New Roman" w:cs="Times New Roman"/>
-          <w:sz w:val="24"/>
-          <w:szCs w:val="24"/>
-        </w:rPr>
-        <w:t>firstName</w:t>
-      </w:r>
-      <w:proofErr w:type="spellEnd"/>
-      <w:r>
-        <w:rPr>
-          <w:rFonts w:ascii="Times New Roman" w:hAnsi="Times New Roman" w:cs="Times New Roman"/>
-          <w:sz w:val="24"/>
-          <w:szCs w:val="24"/>
-        </w:rPr>
-        <w:t xml:space="preserve">, </w:t>
-      </w:r>
-      <w:proofErr w:type="spellStart"/>
-      <w:r>
-        <w:rPr>
-          <w:rFonts w:ascii="Times New Roman" w:hAnsi="Times New Roman" w:cs="Times New Roman"/>
-          <w:sz w:val="24"/>
-          <w:szCs w:val="24"/>
-        </w:rPr>
-        <w:t>lastName</w:t>
-      </w:r>
-      <w:proofErr w:type="spellEnd"/>
-      <w:r>
-        <w:rPr>
-          <w:rFonts w:ascii="Times New Roman" w:hAnsi="Times New Roman" w:cs="Times New Roman"/>
-          <w:sz w:val="24"/>
-          <w:szCs w:val="24"/>
-        </w:rPr>
-        <w:t xml:space="preserve">, </w:t>
-      </w:r>
-      <w:proofErr w:type="spellStart"/>
-      <w:r>
-        <w:rPr>
-          <w:rFonts w:ascii="Times New Roman" w:hAnsi="Times New Roman" w:cs="Times New Roman"/>
-          <w:sz w:val="24"/>
-          <w:szCs w:val="24"/>
-        </w:rPr>
-        <w:t>fullName</w:t>
-      </w:r>
-      <w:proofErr w:type="spellEnd"/>
-      <w:r>
-        <w:rPr>
-          <w:rFonts w:ascii="Times New Roman" w:hAnsi="Times New Roman" w:cs="Times New Roman"/>
-          <w:sz w:val="24"/>
-          <w:szCs w:val="24"/>
-        </w:rPr>
-        <w:t xml:space="preserve">* [derived], </w:t>
-      </w:r>
-      <w:proofErr w:type="spellStart"/>
-      <w:r>
-        <w:rPr>
-          <w:rFonts w:ascii="Times New Roman" w:hAnsi="Times New Roman" w:cs="Times New Roman"/>
-          <w:sz w:val="24"/>
-          <w:szCs w:val="24"/>
-        </w:rPr>
-        <w:t>ageGroup</w:t>
-      </w:r>
-      <w:proofErr w:type="spellEnd"/>
-      <w:r>
-        <w:rPr>
-          <w:rFonts w:ascii="Times New Roman" w:hAnsi="Times New Roman" w:cs="Times New Roman"/>
-          <w:sz w:val="24"/>
-          <w:szCs w:val="24"/>
-        </w:rPr>
-        <w:t xml:space="preserve">, gender, </w:t>
-      </w:r>
-      <w:proofErr w:type="spellStart"/>
-      <w:r>
-        <w:rPr>
-          <w:rFonts w:ascii="Times New Roman" w:hAnsi="Times New Roman" w:cs="Times New Roman"/>
-          <w:sz w:val="24"/>
-          <w:szCs w:val="24"/>
-        </w:rPr>
-        <w:t>employmentStatus</w:t>
-      </w:r>
-      <w:proofErr w:type="spellEnd"/>
-      <w:r>
-        <w:rPr>
-          <w:rFonts w:ascii="Times New Roman" w:hAnsi="Times New Roman" w:cs="Times New Roman"/>
-          <w:sz w:val="24"/>
-          <w:szCs w:val="24"/>
-        </w:rPr>
-        <w:t xml:space="preserve">, </w:t>
-      </w:r>
-      <w:proofErr w:type="spellStart"/>
-      <w:r>
-        <w:rPr>
-          <w:rFonts w:ascii="Times New Roman" w:hAnsi="Times New Roman" w:cs="Times New Roman"/>
-          <w:sz w:val="24"/>
-          <w:szCs w:val="24"/>
-        </w:rPr>
-        <w:t>priorDigitalSkill</w:t>
-      </w:r>
-      <w:proofErr w:type="spellEnd"/>
-      <w:r>
-        <w:rPr>
-          <w:rFonts w:ascii="Times New Roman" w:hAnsi="Times New Roman" w:cs="Times New Roman"/>
-          <w:sz w:val="24"/>
-          <w:szCs w:val="24"/>
-        </w:rPr>
-        <w:t xml:space="preserve">, </w:t>
-      </w:r>
-      <w:proofErr w:type="spellStart"/>
-      <w:r>
-        <w:rPr>
-          <w:rFonts w:ascii="Times New Roman" w:hAnsi="Times New Roman" w:cs="Times New Roman"/>
-          <w:sz w:val="24"/>
-          <w:szCs w:val="24"/>
-        </w:rPr>
-        <w:t>regionID</w:t>
-      </w:r>
-      <w:proofErr w:type="spellEnd"/>
-      <w:r>
-        <w:rPr>
-          <w:rFonts w:ascii="Times New Roman" w:hAnsi="Times New Roman" w:cs="Times New Roman"/>
-          <w:sz w:val="24"/>
-          <w:szCs w:val="24"/>
-        </w:rPr>
-        <w:t xml:space="preserve"> [FK], </w:t>
-      </w:r>
-      <w:proofErr w:type="spellStart"/>
-      <w:r>
-        <w:rPr>
-          <w:rFonts w:ascii="Times New Roman" w:hAnsi="Times New Roman" w:cs="Times New Roman"/>
-          <w:sz w:val="24"/>
-          <w:szCs w:val="24"/>
-        </w:rPr>
-        <w:t>registrationDate</w:t>
-      </w:r>
-      <w:proofErr w:type="spellEnd"/>
-      <w:r>
-        <w:rPr>
-          <w:rFonts w:ascii="Times New Roman" w:hAnsi="Times New Roman" w:cs="Times New Roman"/>
-          <w:sz w:val="24"/>
-          <w:szCs w:val="24"/>
-        </w:rPr>
-        <w:t>)</w:t>
-      </w:r>
-    </w:p>
-    <w:p>
-      <w:pPr>
-        <w:spacing w:after="0" w:line="276" w:lineRule="auto"/>
-        <w:jc w:val="both"/>
-        <w:rPr>
-          <w:rFonts w:ascii="Times New Roman" w:hAnsi="Times New Roman" w:cs="Times New Roman"/>
-          <w:sz w:val="24"/>
-          <w:szCs w:val="24"/>
-        </w:rPr>
-      </w:pPr>
-      <w:proofErr w:type="spellStart"/>
-      <w:r>
-        <w:rPr>
-          <w:rFonts w:ascii="Times New Roman" w:hAnsi="Times New Roman" w:cs="Times New Roman"/>
-          <w:sz w:val="24"/>
-          <w:szCs w:val="24"/>
-        </w:rPr>
-        <w:t>tblEnrolment</w:t>
-      </w:r>
-      <w:proofErr w:type="spellEnd"/>
-      <w:r>
-        <w:rPr>
-          <w:rFonts w:ascii="Times New Roman" w:hAnsi="Times New Roman" w:cs="Times New Roman"/>
-          <w:sz w:val="24"/>
-          <w:szCs w:val="24"/>
-        </w:rPr>
-        <w:t xml:space="preserve"> (</w:t>
-      </w:r>
-      <w:proofErr w:type="spellStart"/>
-      <w:r>
-        <w:rPr>
-          <w:rFonts w:ascii="Times New Roman" w:hAnsi="Times New Roman" w:cs="Times New Roman"/>
-          <w:sz w:val="24"/>
-          <w:szCs w:val="24"/>
-        </w:rPr>
-        <w:t>enrolmentID</w:t>
-      </w:r>
-      <w:proofErr w:type="spellEnd"/>
-      <w:r>
-        <w:rPr>
-          <w:rFonts w:ascii="Times New Roman" w:hAnsi="Times New Roman" w:cs="Times New Roman"/>
-          <w:sz w:val="24"/>
-          <w:szCs w:val="24"/>
-        </w:rPr>
-        <w:t xml:space="preserve"> [PK], </w:t>
-      </w:r>
-      <w:proofErr w:type="spellStart"/>
-      <w:r>
-        <w:rPr>
-          <w:rFonts w:ascii="Times New Roman" w:hAnsi="Times New Roman" w:cs="Times New Roman"/>
-          <w:sz w:val="24"/>
-          <w:szCs w:val="24"/>
-        </w:rPr>
-        <w:t>participantID</w:t>
-      </w:r>
-      <w:proofErr w:type="spellEnd"/>
-      <w:r>
-        <w:rPr>
-          <w:rFonts w:ascii="Times New Roman" w:hAnsi="Times New Roman" w:cs="Times New Roman"/>
-          <w:sz w:val="24"/>
-          <w:szCs w:val="24"/>
-        </w:rPr>
-        <w:t xml:space="preserve"> [FK], </w:t>
-      </w:r>
-      <w:proofErr w:type="spellStart"/>
-      <w:r>
-        <w:rPr>
-          <w:rFonts w:ascii="Times New Roman" w:hAnsi="Times New Roman" w:cs="Times New Roman"/>
-          <w:sz w:val="24"/>
-          <w:szCs w:val="24"/>
-        </w:rPr>
-        <w:t>pcID</w:t>
-      </w:r>
-      <w:proofErr w:type="spellEnd"/>
-      <w:r>
-        <w:rPr>
-          <w:rFonts w:ascii="Times New Roman" w:hAnsi="Times New Roman" w:cs="Times New Roman"/>
-          <w:sz w:val="24"/>
-          <w:szCs w:val="24"/>
-        </w:rPr>
-        <w:t xml:space="preserve"> [FK], </w:t>
-      </w:r>
-      <w:proofErr w:type="spellStart"/>
-      <w:r>
-        <w:rPr>
-          <w:rFonts w:ascii="Times New Roman" w:hAnsi="Times New Roman" w:cs="Times New Roman"/>
-          <w:sz w:val="24"/>
-          <w:szCs w:val="24"/>
-        </w:rPr>
-        <w:t>enrolDate</w:t>
-      </w:r>
-      <w:proofErr w:type="spellEnd"/>
-      <w:r>
-        <w:rPr>
-          <w:rFonts w:ascii="Times New Roman" w:hAnsi="Times New Roman" w:cs="Times New Roman"/>
-          <w:sz w:val="24"/>
-          <w:szCs w:val="24"/>
-        </w:rPr>
-        <w:t xml:space="preserve">, </w:t>
-      </w:r>
-      <w:proofErr w:type="spellStart"/>
-      <w:r>
-        <w:rPr>
-          <w:rFonts w:ascii="Times New Roman" w:hAnsi="Times New Roman" w:cs="Times New Roman"/>
-          <w:sz w:val="24"/>
-          <w:szCs w:val="24"/>
-        </w:rPr>
-        <w:t>attendanceRate</w:t>
-      </w:r>
-      <w:proofErr w:type="spellEnd"/>
-      <w:r>
-        <w:rPr>
-          <w:rFonts w:ascii="Times New Roman" w:hAnsi="Times New Roman" w:cs="Times New Roman"/>
-          <w:sz w:val="24"/>
-          <w:szCs w:val="24"/>
-        </w:rPr>
-        <w:t xml:space="preserve">, </w:t>
-      </w:r>
-      <w:proofErr w:type="spellStart"/>
-      <w:r>
-        <w:rPr>
-          <w:rFonts w:ascii="Times New Roman" w:hAnsi="Times New Roman" w:cs="Times New Roman"/>
-          <w:sz w:val="24"/>
-          <w:szCs w:val="24"/>
-        </w:rPr>
-        <w:t>completionStatus</w:t>
-      </w:r>
-      <w:proofErr w:type="spellEnd"/>
-      <w:r>
-        <w:rPr>
-          <w:rFonts w:ascii="Times New Roman" w:hAnsi="Times New Roman" w:cs="Times New Roman"/>
-          <w:sz w:val="24"/>
-          <w:szCs w:val="24"/>
-        </w:rPr>
-        <w:t xml:space="preserve">, </w:t>
-      </w:r>
-      <w:proofErr w:type="spellStart"/>
-      <w:r>
-        <w:rPr>
-          <w:rFonts w:ascii="Times New Roman" w:hAnsi="Times New Roman" w:cs="Times New Roman"/>
-          <w:sz w:val="24"/>
-          <w:szCs w:val="24"/>
-        </w:rPr>
-        <w:t>preAssessmentScore</w:t>
-      </w:r>
-      <w:proofErr w:type="spellEnd"/>
-      <w:r>
-        <w:rPr>
-          <w:rFonts w:ascii="Times New Roman" w:hAnsi="Times New Roman" w:cs="Times New Roman"/>
-          <w:sz w:val="24"/>
-          <w:szCs w:val="24"/>
-        </w:rPr>
-        <w:t xml:space="preserve">, </w:t>
-      </w:r>
-      <w:proofErr w:type="spellStart"/>
-      <w:r>
-        <w:rPr>
-          <w:rFonts w:ascii="Times New Roman" w:hAnsi="Times New Roman" w:cs="Times New Roman"/>
-          <w:sz w:val="24"/>
-          <w:szCs w:val="24"/>
-        </w:rPr>
-        <w:t>postAssessmentScore</w:t>
-      </w:r>
-      <w:proofErr w:type="spellEnd"/>
-      <w:r>
-        <w:rPr>
-          <w:rFonts w:ascii="Times New Roman" w:hAnsi="Times New Roman" w:cs="Times New Roman"/>
-          <w:sz w:val="24"/>
-          <w:szCs w:val="24"/>
-        </w:rPr>
-        <w:t xml:space="preserve">, </w:t>
-      </w:r>
-      <w:proofErr w:type="spellStart"/>
-      <w:r>
-        <w:rPr>
-          <w:rFonts w:ascii="Times New Roman" w:hAnsi="Times New Roman" w:cs="Times New Roman"/>
-          <w:sz w:val="24"/>
-          <w:szCs w:val="24"/>
-        </w:rPr>
-        <w:t>scoreImprovement</w:t>
-      </w:r>
-      <w:proofErr w:type="spellEnd"/>
-      <w:r>
-        <w:rPr>
-          <w:rFonts w:ascii="Times New Roman" w:hAnsi="Times New Roman" w:cs="Times New Roman"/>
-          <w:sz w:val="24"/>
-          <w:szCs w:val="24"/>
-        </w:rPr>
-        <w:t xml:space="preserve">* [derived], </w:t>
-      </w:r>
-      <w:proofErr w:type="spellStart"/>
-      <w:r>
-        <w:rPr>
-          <w:rFonts w:ascii="Times New Roman" w:hAnsi="Times New Roman" w:cs="Times New Roman"/>
-          <w:sz w:val="24"/>
-          <w:szCs w:val="24"/>
-        </w:rPr>
-        <w:t>certificateIssued</w:t>
-      </w:r>
-      <w:proofErr w:type="spellEnd"/>
-      <w:r>
-        <w:rPr>
-          <w:rFonts w:ascii="Times New Roman" w:hAnsi="Times New Roman" w:cs="Times New Roman"/>
-          <w:sz w:val="24"/>
-          <w:szCs w:val="24"/>
-        </w:rPr>
-        <w:t>)</w:t>
-      </w:r>
-    </w:p>
-    <w:p>
-      <w:pPr>
-        <w:spacing w:after="0" w:line="276" w:lineRule="auto"/>
-        <w:jc w:val="both"/>
-        <w:rPr>
-          <w:rFonts w:ascii="Times New Roman" w:hAnsi="Times New Roman" w:cs="Times New Roman"/>
-          <w:sz w:val="24"/>
-          <w:szCs w:val="24"/>
-        </w:rPr>
-      </w:pPr>
-      <w:proofErr w:type="spellStart"/>
-      <w:r>
-        <w:rPr>
-          <w:rFonts w:ascii="Times New Roman" w:hAnsi="Times New Roman" w:cs="Times New Roman"/>
+          <w:b/>
+          <w:bCs/>
+          <w:sz w:val="24"/>
+          <w:szCs w:val="24"/>
+        </w:rPr>
+      </w:pPr>
+      <w:r>
+        <w:rPr>
+          <w:rFonts w:ascii="Times New Roman" w:eastAsiaTheme="minorHAnsi" w:hAnsi="Times New Roman" w:cs="Times New Roman"/>
+          <w:color w:val="auto"/>
           <w:sz w:val="24"/>
           <w:szCs w:val="24"/>
         </w:rPr>
         <w:lastRenderedPageBreak/>
-        <w:t>tblRegion</w:t>
-      </w:r>
-      <w:proofErr w:type="spellEnd"/>
-      <w:r>
-        <w:rPr>
-          <w:rFonts w:ascii="Times New Roman" w:hAnsi="Times New Roman" w:cs="Times New Roman"/>
-          <w:sz w:val="24"/>
-          <w:szCs w:val="24"/>
-        </w:rPr>
-        <w:t xml:space="preserve"> &lt;- one to many -&gt; </w:t>
-      </w:r>
-      <w:proofErr w:type="spellStart"/>
-      <w:r>
-        <w:rPr>
-          <w:rFonts w:ascii="Times New Roman" w:hAnsi="Times New Roman" w:cs="Times New Roman"/>
-          <w:sz w:val="24"/>
-          <w:szCs w:val="24"/>
-        </w:rPr>
-        <w:t>tblTrainer</w:t>
-      </w:r>
-      <w:proofErr w:type="spellEnd"/>
-      <w:r>
-        <w:rPr>
-          <w:rFonts w:ascii="Times New Roman" w:hAnsi="Times New Roman" w:cs="Times New Roman"/>
-          <w:sz w:val="24"/>
-          <w:szCs w:val="24"/>
-        </w:rPr>
-        <w:t xml:space="preserve"> (one region has many trainers, each trainer belongs to one region) </w:t>
-      </w:r>
-      <w:proofErr w:type="spellStart"/>
-      <w:r>
-        <w:rPr>
-          <w:rFonts w:ascii="Times New Roman" w:hAnsi="Times New Roman" w:cs="Times New Roman"/>
-          <w:sz w:val="24"/>
-          <w:szCs w:val="24"/>
-        </w:rPr>
-        <w:t>tblRegion</w:t>
-      </w:r>
-      <w:proofErr w:type="spellEnd"/>
-      <w:r>
-        <w:rPr>
-          <w:rFonts w:ascii="Times New Roman" w:hAnsi="Times New Roman" w:cs="Times New Roman"/>
-          <w:sz w:val="24"/>
-          <w:szCs w:val="24"/>
-        </w:rPr>
-        <w:t xml:space="preserve"> &lt;- one to many -&gt; </w:t>
-      </w:r>
-      <w:proofErr w:type="spellStart"/>
-      <w:r>
-        <w:rPr>
-          <w:rFonts w:ascii="Times New Roman" w:hAnsi="Times New Roman" w:cs="Times New Roman"/>
-          <w:sz w:val="24"/>
-          <w:szCs w:val="24"/>
-        </w:rPr>
-        <w:t>tblProgramme</w:t>
-      </w:r>
-      <w:proofErr w:type="spellEnd"/>
-      <w:r>
-        <w:rPr>
-          <w:rFonts w:ascii="Times New Roman" w:hAnsi="Times New Roman" w:cs="Times New Roman"/>
-          <w:sz w:val="24"/>
-          <w:szCs w:val="24"/>
-        </w:rPr>
-        <w:t xml:space="preserve"> (region hosts many programmes, each programme is in one region) </w:t>
-      </w:r>
-    </w:p>
-    <w:p>
-      <w:pPr>
-        <w:spacing w:after="0" w:line="276" w:lineRule="auto"/>
-        <w:jc w:val="both"/>
-        <w:rPr>
-          <w:rFonts w:ascii="Times New Roman" w:hAnsi="Times New Roman" w:cs="Times New Roman"/>
-          <w:sz w:val="24"/>
-          <w:szCs w:val="24"/>
-        </w:rPr>
-      </w:pPr>
-      <w:proofErr w:type="spellStart"/>
-      <w:r>
-        <w:rPr>
-          <w:rFonts w:ascii="Times New Roman" w:hAnsi="Times New Roman" w:cs="Times New Roman"/>
-          <w:sz w:val="24"/>
-          <w:szCs w:val="24"/>
-        </w:rPr>
-        <w:t>tblRegion</w:t>
-      </w:r>
-      <w:proofErr w:type="spellEnd"/>
-      <w:r>
-        <w:rPr>
-          <w:rFonts w:ascii="Times New Roman" w:hAnsi="Times New Roman" w:cs="Times New Roman"/>
-          <w:sz w:val="24"/>
-          <w:szCs w:val="24"/>
-        </w:rPr>
-        <w:t xml:space="preserve"> &lt;- one to many -&gt; </w:t>
-      </w:r>
-      <w:proofErr w:type="spellStart"/>
-      <w:r>
-        <w:rPr>
-          <w:rFonts w:ascii="Times New Roman" w:hAnsi="Times New Roman" w:cs="Times New Roman"/>
-          <w:sz w:val="24"/>
-          <w:szCs w:val="24"/>
-        </w:rPr>
-        <w:t>tblParticipant</w:t>
-      </w:r>
-      <w:proofErr w:type="spellEnd"/>
-      <w:r>
-        <w:rPr>
-          <w:rFonts w:ascii="Times New Roman" w:hAnsi="Times New Roman" w:cs="Times New Roman"/>
-          <w:sz w:val="24"/>
-          <w:szCs w:val="24"/>
-        </w:rPr>
-        <w:t xml:space="preserve"> (one region has many participants, each participant is from one region) </w:t>
-      </w:r>
-    </w:p>
-    <w:p>
-      <w:pPr>
-        <w:spacing w:after="0" w:line="276" w:lineRule="auto"/>
-        <w:jc w:val="both"/>
-        <w:rPr>
-          <w:rFonts w:ascii="Times New Roman" w:hAnsi="Times New Roman" w:cs="Times New Roman"/>
-          <w:sz w:val="24"/>
-          <w:szCs w:val="24"/>
-        </w:rPr>
-      </w:pPr>
-      <w:proofErr w:type="spellStart"/>
-      <w:r>
-        <w:rPr>
-          <w:rFonts w:ascii="Times New Roman" w:hAnsi="Times New Roman" w:cs="Times New Roman"/>
-          <w:sz w:val="24"/>
-          <w:szCs w:val="24"/>
-        </w:rPr>
-        <w:t>tblFundingSource</w:t>
-      </w:r>
-      <w:proofErr w:type="spellEnd"/>
-      <w:r>
-        <w:rPr>
-          <w:rFonts w:ascii="Times New Roman" w:hAnsi="Times New Roman" w:cs="Times New Roman"/>
-          <w:sz w:val="24"/>
-          <w:szCs w:val="24"/>
-        </w:rPr>
-        <w:t xml:space="preserve"> &lt;- one to many -&gt; </w:t>
-      </w:r>
-      <w:proofErr w:type="spellStart"/>
-      <w:r>
-        <w:rPr>
-          <w:rFonts w:ascii="Times New Roman" w:hAnsi="Times New Roman" w:cs="Times New Roman"/>
-          <w:sz w:val="24"/>
-          <w:szCs w:val="24"/>
-        </w:rPr>
-        <w:t>tblProgramme</w:t>
-      </w:r>
-      <w:proofErr w:type="spellEnd"/>
-      <w:r>
-        <w:rPr>
-          <w:rFonts w:ascii="Times New Roman" w:hAnsi="Times New Roman" w:cs="Times New Roman"/>
-          <w:sz w:val="24"/>
-          <w:szCs w:val="24"/>
-        </w:rPr>
-        <w:t xml:space="preserve"> (one funding source funds many programmes) </w:t>
-      </w:r>
-    </w:p>
-    <w:p>
-      <w:pPr>
-        <w:spacing w:after="0" w:line="276" w:lineRule="auto"/>
-        <w:jc w:val="both"/>
-        <w:rPr>
-          <w:rFonts w:ascii="Times New Roman" w:hAnsi="Times New Roman" w:cs="Times New Roman"/>
-          <w:sz w:val="24"/>
-          <w:szCs w:val="24"/>
-        </w:rPr>
-      </w:pPr>
-      <w:proofErr w:type="spellStart"/>
-      <w:r>
-        <w:rPr>
-          <w:rFonts w:ascii="Times New Roman" w:hAnsi="Times New Roman" w:cs="Times New Roman"/>
-          <w:sz w:val="24"/>
-          <w:szCs w:val="24"/>
-        </w:rPr>
-        <w:t>tblProgramme</w:t>
-      </w:r>
-      <w:proofErr w:type="spellEnd"/>
-      <w:r>
-        <w:rPr>
-          <w:rFonts w:ascii="Times New Roman" w:hAnsi="Times New Roman" w:cs="Times New Roman"/>
-          <w:sz w:val="24"/>
-          <w:szCs w:val="24"/>
-        </w:rPr>
-        <w:t xml:space="preserve"> &lt;- many to many -&gt; </w:t>
-      </w:r>
-      <w:proofErr w:type="spellStart"/>
-      <w:r>
-        <w:rPr>
-          <w:rFonts w:ascii="Times New Roman" w:hAnsi="Times New Roman" w:cs="Times New Roman"/>
-          <w:sz w:val="24"/>
-          <w:szCs w:val="24"/>
-        </w:rPr>
-        <w:t>tblCourse</w:t>
-      </w:r>
-      <w:proofErr w:type="spellEnd"/>
-      <w:r>
-        <w:rPr>
-          <w:rFonts w:ascii="Times New Roman" w:hAnsi="Times New Roman" w:cs="Times New Roman"/>
-          <w:sz w:val="24"/>
-          <w:szCs w:val="24"/>
-        </w:rPr>
-        <w:t xml:space="preserve"> (resolved via </w:t>
-      </w:r>
-      <w:proofErr w:type="spellStart"/>
-      <w:r>
-        <w:rPr>
-          <w:rFonts w:ascii="Times New Roman" w:hAnsi="Times New Roman" w:cs="Times New Roman"/>
-          <w:sz w:val="24"/>
-          <w:szCs w:val="24"/>
-        </w:rPr>
-        <w:t>tblProgrammeCourse</w:t>
-      </w:r>
-      <w:proofErr w:type="spellEnd"/>
-      <w:r>
-        <w:rPr>
-          <w:rFonts w:ascii="Times New Roman" w:hAnsi="Times New Roman" w:cs="Times New Roman"/>
-          <w:sz w:val="24"/>
-          <w:szCs w:val="24"/>
-        </w:rPr>
-        <w:t xml:space="preserve">) </w:t>
-      </w:r>
-    </w:p>
-    <w:p>
-      <w:pPr>
-        <w:spacing w:after="0" w:line="276" w:lineRule="auto"/>
-        <w:jc w:val="both"/>
-        <w:rPr>
-          <w:rFonts w:ascii="Times New Roman" w:hAnsi="Times New Roman" w:cs="Times New Roman"/>
-          <w:sz w:val="24"/>
-          <w:szCs w:val="24"/>
-        </w:rPr>
-      </w:pPr>
-      <w:proofErr w:type="spellStart"/>
-      <w:r>
-        <w:rPr>
-          <w:rFonts w:ascii="Times New Roman" w:hAnsi="Times New Roman" w:cs="Times New Roman"/>
-          <w:sz w:val="24"/>
-          <w:szCs w:val="24"/>
-        </w:rPr>
-        <w:t>tblTrainer</w:t>
-      </w:r>
-      <w:proofErr w:type="spellEnd"/>
-      <w:r>
-        <w:rPr>
-          <w:rFonts w:ascii="Times New Roman" w:hAnsi="Times New Roman" w:cs="Times New Roman"/>
-          <w:sz w:val="24"/>
-          <w:szCs w:val="24"/>
-        </w:rPr>
-        <w:t xml:space="preserve"> &lt;- one to many -&gt; </w:t>
-      </w:r>
-      <w:proofErr w:type="spellStart"/>
-      <w:r>
-        <w:rPr>
-          <w:rFonts w:ascii="Times New Roman" w:hAnsi="Times New Roman" w:cs="Times New Roman"/>
-          <w:sz w:val="24"/>
-          <w:szCs w:val="24"/>
-        </w:rPr>
-        <w:t>tblProgrammeCourse</w:t>
-      </w:r>
-      <w:proofErr w:type="spellEnd"/>
-      <w:r>
-        <w:rPr>
-          <w:rFonts w:ascii="Times New Roman" w:hAnsi="Times New Roman" w:cs="Times New Roman"/>
-          <w:sz w:val="24"/>
-          <w:szCs w:val="24"/>
-        </w:rPr>
-        <w:t xml:space="preserve"> (one trainer delivers many programme courses) </w:t>
-      </w:r>
-    </w:p>
-    <w:p>
-      <w:pPr>
-        <w:spacing w:after="0" w:line="276" w:lineRule="auto"/>
-        <w:jc w:val="both"/>
-        <w:rPr>
-          <w:rFonts w:ascii="Times New Roman" w:hAnsi="Times New Roman" w:cs="Times New Roman"/>
-          <w:sz w:val="24"/>
-          <w:szCs w:val="24"/>
-        </w:rPr>
-      </w:pPr>
-      <w:proofErr w:type="spellStart"/>
-      <w:r>
-        <w:rPr>
-          <w:rFonts w:ascii="Times New Roman" w:hAnsi="Times New Roman" w:cs="Times New Roman"/>
-          <w:sz w:val="24"/>
-          <w:szCs w:val="24"/>
-        </w:rPr>
-        <w:t>tblParticipant</w:t>
-      </w:r>
-      <w:proofErr w:type="spellEnd"/>
-      <w:r>
-        <w:rPr>
-          <w:rFonts w:ascii="Times New Roman" w:hAnsi="Times New Roman" w:cs="Times New Roman"/>
-          <w:sz w:val="24"/>
-          <w:szCs w:val="24"/>
-        </w:rPr>
-        <w:t xml:space="preserve"> &lt;- one to many -&gt; </w:t>
-      </w:r>
-      <w:proofErr w:type="spellStart"/>
-      <w:r>
-        <w:rPr>
-          <w:rFonts w:ascii="Times New Roman" w:hAnsi="Times New Roman" w:cs="Times New Roman"/>
-          <w:sz w:val="24"/>
-          <w:szCs w:val="24"/>
-        </w:rPr>
-        <w:t>tblEnrolment</w:t>
-      </w:r>
-      <w:proofErr w:type="spellEnd"/>
-      <w:r>
-        <w:rPr>
-          <w:rFonts w:ascii="Times New Roman" w:hAnsi="Times New Roman" w:cs="Times New Roman"/>
-          <w:sz w:val="24"/>
-          <w:szCs w:val="24"/>
-        </w:rPr>
-        <w:t xml:space="preserve"> (one participant can enrol in many courses) </w:t>
-      </w:r>
-    </w:p>
-    <w:p>
-      <w:pPr>
-        <w:spacing w:after="0" w:line="276" w:lineRule="auto"/>
-        <w:jc w:val="both"/>
-        <w:rPr>
-          <w:rFonts w:ascii="Times New Roman" w:hAnsi="Times New Roman" w:cs="Times New Roman"/>
-          <w:sz w:val="24"/>
-          <w:szCs w:val="24"/>
-        </w:rPr>
-      </w:pPr>
-      <w:proofErr w:type="spellStart"/>
-      <w:r>
-        <w:rPr>
-          <w:rFonts w:ascii="Times New Roman" w:hAnsi="Times New Roman" w:cs="Times New Roman"/>
-          <w:sz w:val="24"/>
-          <w:szCs w:val="24"/>
-        </w:rPr>
-        <w:t>tblProgrammeCourse</w:t>
-      </w:r>
-      <w:proofErr w:type="spellEnd"/>
-      <w:r>
-        <w:rPr>
-          <w:rFonts w:ascii="Times New Roman" w:hAnsi="Times New Roman" w:cs="Times New Roman"/>
-          <w:sz w:val="24"/>
-          <w:szCs w:val="24"/>
-        </w:rPr>
-        <w:t xml:space="preserve"> &lt;- one to many -&gt; </w:t>
-      </w:r>
-      <w:proofErr w:type="spellStart"/>
-      <w:r>
-        <w:rPr>
-          <w:rFonts w:ascii="Times New Roman" w:hAnsi="Times New Roman" w:cs="Times New Roman"/>
-          <w:sz w:val="24"/>
-          <w:szCs w:val="24"/>
-        </w:rPr>
-        <w:t>tblEnrolment</w:t>
-      </w:r>
-      <w:proofErr w:type="spellEnd"/>
-      <w:r>
-        <w:rPr>
-          <w:rFonts w:ascii="Times New Roman" w:hAnsi="Times New Roman" w:cs="Times New Roman"/>
-          <w:sz w:val="24"/>
-          <w:szCs w:val="24"/>
-        </w:rPr>
-        <w:t xml:space="preserve"> (one programme course can have many participants)</w:t>
+        <w:drawing>
+          <wp:anchor distT="0" distB="0" distL="114300" distR="114300" simplePos="0" relativeHeight="251659264" behindDoc="1" locked="0" layoutInCell="1" allowOverlap="1" wp14:anchorId="035E3179" wp14:editId="4249AE11">
+            <wp:simplePos x="0" y="0"/>
+            <wp:positionH relativeFrom="margin">
+              <wp:align>left</wp:align>
+            </wp:positionH>
+            <wp:positionV relativeFrom="paragraph">
+              <wp:posOffset>284480</wp:posOffset>
+            </wp:positionV>
+            <wp:extent cx="5753100" cy="4566285"/>
+            <wp:effectExtent l="0" t="0" r="0" b="5715"/>
+            <wp:wrapTopAndBottom/>
+            <wp:docPr id="1" name="Picture 1"/>
+            <wp:cNvGraphicFramePr>
+              <a:graphicFrameLocks xmlns:a="http://schemas.openxmlformats.org/drawingml/2006/main" noChangeAspect="1"/>
+            </wp:cNvGraphicFramePr>
+            <a:graphic xmlns:a="http://schemas.openxmlformats.org/drawingml/2006/main">
+              <a:graphicData uri="http://schemas.openxmlformats.org/drawingml/2006/picture">
+                <pic:pic xmlns:pic="http://schemas.openxmlformats.org/drawingml/2006/picture">
+                  <pic:nvPicPr>
+                    <pic:cNvPr id="1" name=""/>
+                    <pic:cNvPicPr/>
+                  </pic:nvPicPr>
+                  <pic:blipFill>
+                    <a:blip r:embed="rId5">
+                      <a:extLst>
+                        <a:ext uri="{28A0092B-C50C-407E-A947-70E740481C1C}">
+                          <a14:useLocalDpi xmlns:a14="http://schemas.microsoft.com/office/drawing/2010/main" val="0"/>
+                        </a:ext>
+                      </a:extLst>
+                    </a:blip>
+                    <a:stretch>
+                      <a:fillRect/>
+                    </a:stretch>
+                  </pic:blipFill>
+                  <pic:spPr>
+                    <a:xfrm>
+                      <a:off x="0" y="0"/>
+                      <a:ext cx="5767376" cy="4577937"/>
+                    </a:xfrm>
+                    <a:prstGeom prst="rect">
+                      <a:avLst/>
+                    </a:prstGeom>
+                  </pic:spPr>
+                </pic:pic>
+              </a:graphicData>
+            </a:graphic>
+            <wp14:sizeRelH relativeFrom="margin">
+              <wp14:pctWidth>0</wp14:pctWidth>
+            </wp14:sizeRelH>
+            <wp14:sizeRelV relativeFrom="margin">
+              <wp14:pctHeight>0</wp14:pctHeight>
+            </wp14:sizeRelV>
+          </wp:anchor>
+        </w:drawing>
+      </w:r>
+      <w:r>
+        <w:rPr>
+          <w:rFonts w:ascii="Times New Roman" w:hAnsi="Times New Roman" w:cs="Times New Roman"/>
+          <w:b/>
+          <w:bCs/>
+          <w:sz w:val="24"/>
+          <w:szCs w:val="24"/>
+        </w:rPr>
+        <w:t>Initial Data Model (ERD)</w:t>
       </w:r>
     </w:p>
     <w:p>
@@ -2626,243 +1411,6 @@
           <w:szCs w:val="24"/>
         </w:rPr>
         <w:t>status, region</w:t>
-      </w:r>
-    </w:p>
-    <w:p>
-      <w:pPr>
-        <w:pStyle w:val="Heading3"/>
-        <w:spacing w:after="0" w:line="276" w:lineRule="auto"/>
-        <w:jc w:val="both"/>
-        <w:rPr>
-          <w:rFonts w:ascii="Times New Roman" w:hAnsi="Times New Roman" w:cs="Times New Roman"/>
-          <w:b/>
-          <w:bCs/>
-          <w:sz w:val="24"/>
-          <w:szCs w:val="24"/>
-        </w:rPr>
-      </w:pPr>
-      <w:r>
-        <w:rPr>
-          <w:rFonts w:ascii="Times New Roman" w:hAnsi="Times New Roman" w:cs="Times New Roman"/>
-          <w:b/>
-          <w:bCs/>
-          <w:sz w:val="24"/>
-          <w:szCs w:val="24"/>
-        </w:rPr>
-        <w:t>Data Integrity and Security Considerations</w:t>
-      </w:r>
-    </w:p>
-    <w:p>
-      <w:pPr>
-        <w:spacing w:after="0" w:line="276" w:lineRule="auto"/>
-        <w:jc w:val="both"/>
-        <w:rPr>
-          <w:rFonts w:ascii="Times New Roman" w:hAnsi="Times New Roman" w:cs="Times New Roman"/>
-          <w:sz w:val="24"/>
-          <w:szCs w:val="24"/>
-        </w:rPr>
-      </w:pPr>
-      <w:r>
-        <w:rPr>
-          <w:rFonts w:ascii="Times New Roman" w:hAnsi="Times New Roman" w:cs="Times New Roman"/>
-          <w:sz w:val="24"/>
-          <w:szCs w:val="24"/>
-        </w:rPr>
-        <w:t>Every table has a primary key to make sure each record is unique and can always be found. Foreign keys protect the relationships between tables</w:t>
-      </w:r>
-      <w:r>
-        <w:rPr>
-          <w:rFonts w:ascii="Times New Roman" w:hAnsi="Times New Roman" w:cs="Times New Roman"/>
-          <w:sz w:val="24"/>
-          <w:szCs w:val="24"/>
-        </w:rPr>
-        <w:t>,</w:t>
-      </w:r>
-      <w:r>
-        <w:rPr>
-          <w:rFonts w:ascii="Times New Roman" w:hAnsi="Times New Roman" w:cs="Times New Roman"/>
-          <w:sz w:val="24"/>
-          <w:szCs w:val="24"/>
-        </w:rPr>
-        <w:t xml:space="preserve"> without them it would be possible to link a trainer to a programme that does not exist</w:t>
-      </w:r>
-      <w:r>
-        <w:rPr>
-          <w:rFonts w:ascii="Times New Roman" w:hAnsi="Times New Roman" w:cs="Times New Roman"/>
-          <w:sz w:val="24"/>
-          <w:szCs w:val="24"/>
-        </w:rPr>
-        <w:t xml:space="preserve"> and that </w:t>
-      </w:r>
-      <w:r>
-        <w:rPr>
-          <w:rFonts w:ascii="Times New Roman" w:hAnsi="Times New Roman" w:cs="Times New Roman"/>
-          <w:sz w:val="24"/>
-          <w:szCs w:val="24"/>
-        </w:rPr>
-        <w:t xml:space="preserve">would make the data meaningless. NOT NULL constraints on fields like </w:t>
-      </w:r>
-      <w:proofErr w:type="spellStart"/>
-      <w:r>
-        <w:rPr>
-          <w:rFonts w:ascii="Times New Roman" w:hAnsi="Times New Roman" w:cs="Times New Roman"/>
-          <w:sz w:val="24"/>
-          <w:szCs w:val="24"/>
-        </w:rPr>
-        <w:t>enrolDate</w:t>
-      </w:r>
-      <w:proofErr w:type="spellEnd"/>
-      <w:r>
-        <w:rPr>
-          <w:rFonts w:ascii="Times New Roman" w:hAnsi="Times New Roman" w:cs="Times New Roman"/>
-          <w:sz w:val="24"/>
-          <w:szCs w:val="24"/>
-        </w:rPr>
-        <w:t xml:space="preserve"> and </w:t>
-      </w:r>
-      <w:proofErr w:type="spellStart"/>
-      <w:r>
-        <w:rPr>
-          <w:rFonts w:ascii="Times New Roman" w:hAnsi="Times New Roman" w:cs="Times New Roman"/>
-          <w:sz w:val="24"/>
-          <w:szCs w:val="24"/>
-        </w:rPr>
-        <w:t>preAssessmentScore</w:t>
-      </w:r>
-      <w:proofErr w:type="spellEnd"/>
-      <w:r>
-        <w:rPr>
-          <w:rFonts w:ascii="Times New Roman" w:hAnsi="Times New Roman" w:cs="Times New Roman"/>
-          <w:sz w:val="24"/>
-          <w:szCs w:val="24"/>
-        </w:rPr>
-        <w:t xml:space="preserve"> prevent incomplete records that could break reports. A UNIQUE constraint on </w:t>
-      </w:r>
-      <w:proofErr w:type="spellStart"/>
-      <w:r>
-        <w:rPr>
-          <w:rFonts w:ascii="Times New Roman" w:hAnsi="Times New Roman" w:cs="Times New Roman"/>
-          <w:sz w:val="24"/>
-          <w:szCs w:val="24"/>
-        </w:rPr>
-        <w:t>participantID</w:t>
-      </w:r>
-      <w:proofErr w:type="spellEnd"/>
-      <w:r>
-        <w:rPr>
-          <w:rFonts w:ascii="Times New Roman" w:hAnsi="Times New Roman" w:cs="Times New Roman"/>
-          <w:sz w:val="24"/>
-          <w:szCs w:val="24"/>
-        </w:rPr>
-        <w:t xml:space="preserve"> and </w:t>
-      </w:r>
-      <w:proofErr w:type="spellStart"/>
-      <w:r>
-        <w:rPr>
-          <w:rFonts w:ascii="Times New Roman" w:hAnsi="Times New Roman" w:cs="Times New Roman"/>
-          <w:sz w:val="24"/>
-          <w:szCs w:val="24"/>
-        </w:rPr>
-        <w:t>pcID</w:t>
-      </w:r>
-      <w:proofErr w:type="spellEnd"/>
-      <w:r>
-        <w:rPr>
-          <w:rFonts w:ascii="Times New Roman" w:hAnsi="Times New Roman" w:cs="Times New Roman"/>
-          <w:sz w:val="24"/>
-          <w:szCs w:val="24"/>
-        </w:rPr>
-        <w:t xml:space="preserve"> together in </w:t>
-      </w:r>
-      <w:proofErr w:type="spellStart"/>
-      <w:r>
-        <w:rPr>
-          <w:rFonts w:ascii="Times New Roman" w:hAnsi="Times New Roman" w:cs="Times New Roman"/>
-          <w:sz w:val="24"/>
-          <w:szCs w:val="24"/>
-        </w:rPr>
-        <w:t>tblEnrolment</w:t>
-      </w:r>
-      <w:proofErr w:type="spellEnd"/>
-      <w:r>
-        <w:rPr>
-          <w:rFonts w:ascii="Times New Roman" w:hAnsi="Times New Roman" w:cs="Times New Roman"/>
-          <w:sz w:val="24"/>
-          <w:szCs w:val="24"/>
-        </w:rPr>
-        <w:t xml:space="preserve"> stops the same person being accidentally enrolled twice in the same course. Restricting fields like gender, </w:t>
-      </w:r>
-      <w:proofErr w:type="spellStart"/>
-      <w:r>
-        <w:rPr>
-          <w:rFonts w:ascii="Times New Roman" w:hAnsi="Times New Roman" w:cs="Times New Roman"/>
-          <w:sz w:val="24"/>
-          <w:szCs w:val="24"/>
-        </w:rPr>
-        <w:t>completionStatus</w:t>
-      </w:r>
-      <w:proofErr w:type="spellEnd"/>
-      <w:r>
-        <w:rPr>
-          <w:rFonts w:ascii="Times New Roman" w:hAnsi="Times New Roman" w:cs="Times New Roman"/>
-          <w:sz w:val="24"/>
-          <w:szCs w:val="24"/>
-        </w:rPr>
-        <w:t xml:space="preserve">, and </w:t>
-      </w:r>
-      <w:proofErr w:type="spellStart"/>
-      <w:r>
-        <w:rPr>
-          <w:rFonts w:ascii="Times New Roman" w:hAnsi="Times New Roman" w:cs="Times New Roman"/>
-          <w:sz w:val="24"/>
-          <w:szCs w:val="24"/>
-        </w:rPr>
-        <w:t>difficultyLevel</w:t>
-      </w:r>
-      <w:proofErr w:type="spellEnd"/>
-      <w:r>
-        <w:rPr>
-          <w:rFonts w:ascii="Times New Roman" w:hAnsi="Times New Roman" w:cs="Times New Roman"/>
-          <w:sz w:val="24"/>
-          <w:szCs w:val="24"/>
-        </w:rPr>
-        <w:t xml:space="preserve"> to set values keeps the data consistent, which matters especially when filtering or comparing groups in reports. Derived values like </w:t>
-      </w:r>
-      <w:proofErr w:type="spellStart"/>
-      <w:r>
-        <w:rPr>
-          <w:rFonts w:ascii="Times New Roman" w:hAnsi="Times New Roman" w:cs="Times New Roman"/>
-          <w:sz w:val="24"/>
-          <w:szCs w:val="24"/>
-        </w:rPr>
-        <w:t>scoreImprovement</w:t>
-      </w:r>
-      <w:proofErr w:type="spellEnd"/>
-      <w:r>
-        <w:rPr>
-          <w:rFonts w:ascii="Times New Roman" w:hAnsi="Times New Roman" w:cs="Times New Roman"/>
-          <w:sz w:val="24"/>
-          <w:szCs w:val="24"/>
-        </w:rPr>
-        <w:t xml:space="preserve"> and duration are calculated at query time rather than stored, so they are always accurate and never out of sync with the source data. Front-end validation — for example checking scores are between 0 and 100, or that end dates come after start dates — catches mistakes before they reach the database. Confirmation dialogs before deleting programmes or participants reduce the risk of accidental data loss. Finally, separating administrator and read-only roles </w:t>
-      </w:r>
-      <w:proofErr w:type="gramStart"/>
-      <w:r>
-        <w:rPr>
-          <w:rFonts w:ascii="Times New Roman" w:hAnsi="Times New Roman" w:cs="Times New Roman"/>
-          <w:sz w:val="24"/>
-          <w:szCs w:val="24"/>
-        </w:rPr>
-        <w:t>means</w:t>
-      </w:r>
-      <w:proofErr w:type="gramEnd"/>
-      <w:r>
-        <w:rPr>
-          <w:rFonts w:ascii="Times New Roman" w:hAnsi="Times New Roman" w:cs="Times New Roman"/>
-          <w:sz w:val="24"/>
-          <w:szCs w:val="24"/>
-        </w:rPr>
-        <w:t xml:space="preserve"> education officers can never accidentally modify or delete records they should only be viewing.</w:t>
       </w:r>
     </w:p>
     <w:sectPr>
@@ -5894,6 +4442,7 @@
   <w:style w:type="character" w:default="1" w:styleId="DefaultParagraphFont">
     <w:name w:val="Default Paragraph Font"/>
     <w:uiPriority w:val="1"/>
+    <w:semiHidden/>
     <w:unhideWhenUsed/>
   </w:style>
   <w:style w:type="table" w:default="1" w:styleId="TableNormal">

</xml_diff>